<commit_message>
Add SURGICAL_REMEDIATION_PROMPT.md; correct the audit on P5 and P6
The prompt covers P1 to P6 with exact file paths, variables, verification
commands and an explicit do-not list per item. P5 and P6 are recorded as
already closed rather than as work to do.

AUDIT_REPORT.md corrected on two points. Its P5 remedy said to build a
/reference/ hub; one already existed and links all sixteen pages, and the
finding came from a relative-path regex that missed absolute hrefs. Its
P6 entry said the jrsstandard.html defect was confirmed but not
diagnosed; it is now diagnosed, fixed and described.

Every step in the prompt carries the same regression gate: 72 assertions
across six suites plus the 12-check guard, and a note that a step
reducing that number is wrong rather than the test.

Co-Authored-By: Claude Opus 5 <noreply@anthropic.com>
Claude-Session: https://claude.ai/code/session_01W9UtE7X76spacWeSvBH7tv
</commit_message>
<xml_diff>
--- a/AUDIT_REPORT.docx
+++ b/AUDIT_REPORT.docx
@@ -526,28 +526,52 @@
         <w:rPr>
           <w:b/>
         </w:rPr>
-        <w:t xml:space="preserve">Remediation:</w:t>
-      </w:r>
-      <w:r>
-        <w:t xml:space="preserve"> build a </w:t>
-      </w:r>
-      <w:r>
-        <w:rPr>
-          <w:rFonts w:ascii="Consolas" w:hAnsi="Consolas"/>
-        </w:rPr>
-        <w:t xml:space="preserve">/reference/</w:t>
-      </w:r>
-      <w:r>
-        <w:t xml:space="preserve"> hub page linking all 16, and link that hub from the footer alongside Record Check and Engagement Terms. </w:t>
-      </w:r>
-      <w:r>
-        <w:rPr>
-          <w:b/>
-        </w:rPr>
-        <w:t xml:space="preserve">Not done in this pass</w:t>
-      </w:r>
-      <w:r>
-        <w:t xml:space="preserve">: this is an information-architecture decision, not a defect.</w:t>
+        <w:t xml:space="preserve">CORRECTION, 2026-08-14.</w:t>
+      </w:r>
+      <w:r>
+        <w:t xml:space="preserve"> This finding's remedy was wrong. </w:t>
+      </w:r>
+      <w:r>
+        <w:rPr>
+          <w:b/>
+        </w:rPr>
+        <w:t xml:space="preserve">A hub already exists</w:t>
+      </w:r>
+      <w:r>
+        <w:t xml:space="preserve"> at </w:t>
+      </w:r>
+      <w:r>
+        <w:rPr>
+          <w:rFonts w:ascii="Consolas" w:hAnsi="Consolas"/>
+        </w:rPr>
+        <w:t xml:space="preserve">reference/index.html</w:t>
+      </w:r>
+      <w:r>
+        <w:t xml:space="preserve"> and links all sixteen pages; the check that produced this finding used a relative-path regex and missed absolute </w:t>
+      </w:r>
+      <w:r>
+        <w:rPr>
+          <w:rFonts w:ascii="Consolas" w:hAnsi="Consolas"/>
+        </w:rPr>
+        <w:t xml:space="preserve">href="/reference/&lt;slug&gt;"</w:t>
+      </w:r>
+      <w:r>
+        <w:t xml:space="preserve"> links. The real gap was that only </w:t>
+      </w:r>
+      <w:r>
+        <w:rPr>
+          <w:rFonts w:ascii="Consolas" w:hAnsi="Consolas"/>
+        </w:rPr>
+        <w:t xml:space="preserve">index.html</w:t>
+      </w:r>
+      <w:r>
+        <w:t xml:space="preserve"> linked the hub. </w:t>
+      </w:r>
+      <w:r>
+        <w:rPr>
+          <w:b/>
+        </w:rPr>
+        <w:t xml:space="preserve">CLOSED: the hub is now linked from 38 page footers.</w:t>
       </w:r>
     </w:p>
     <w:p>
@@ -2153,10 +2177,19 @@
         <w:rPr>
           <w:b/>
         </w:rPr>
-        <w:t xml:space="preserve">`jrsstandard.html`</w:t>
-      </w:r>
-      <w:r>
-        <w:t xml:space="preserve"> throws </w:t>
+        <w:t xml:space="preserve">CLOSED 2026-08-14, root cause found.</w:t>
+      </w:r>
+      <w:r>
+        <w:t xml:space="preserve"> </w:t>
+      </w:r>
+      <w:r>
+        <w:rPr>
+          <w:rFonts w:ascii="Consolas" w:hAnsi="Consolas"/>
+        </w:rPr>
+        <w:t xml:space="preserve">jrsstandard.html</w:t>
+      </w:r>
+      <w:r>
+        <w:t xml:space="preserve"> threw </w:t>
       </w:r>
       <w:r>
         <w:rPr>
@@ -2165,52 +2198,88 @@
         <w:t xml:space="preserve">Cannot read properties of null (reading 'style')</w:t>
       </w:r>
       <w:r>
-        <w:t xml:space="preserve"> on load, from a training script referencing </w:t>
-      </w:r>
-      <w:r>
-        <w:rPr>
-          <w:rFonts w:ascii="Consolas" w:hAnsi="Consolas"/>
-        </w:rPr>
-        <w:t xml:space="preserve">progress-fill</w:t>
-      </w:r>
-      <w:r>
-        <w:t xml:space="preserve">, </w:t>
-      </w:r>
-      <w:r>
-        <w:rPr>
-          <w:rFonts w:ascii="Consolas" w:hAnsi="Consolas"/>
-        </w:rPr>
-        <w:t xml:space="preserve">quiz-section</w:t>
-      </w:r>
-      <w:r>
-        <w:t xml:space="preserve">, </w:t>
-      </w:r>
-      <w:r>
-        <w:rPr>
-          <w:rFonts w:ascii="Consolas" w:hAnsi="Consolas"/>
-        </w:rPr>
-        <w:t xml:space="preserve">module-nav</w:t>
-      </w:r>
-      <w:r>
-        <w:t xml:space="preserve"> and </w:t>
-      </w:r>
-      <w:r>
-        <w:rPr>
-          <w:rFonts w:ascii="Consolas" w:hAnsi="Consolas"/>
-        </w:rPr>
-        <w:t xml:space="preserve">course-panel</w:t>
-      </w:r>
-      <w:r>
-        <w:t xml:space="preserve">, none of which exist on that page. It also carries a 2-div imbalance. </w:t>
-      </w:r>
-      <w:r>
-        <w:rPr>
-          <w:b/>
-        </w:rPr>
-        <w:t xml:space="preserve">Both pre-date the current work</w:t>
-      </w:r>
-      <w:r>
-        <w:t xml:space="preserve"> and were confirmed by comparing against the pre-edit file. Fixing it means repairing an unrelated training UI and was out of scope for this pass.</w:t>
+        <w:t xml:space="preserve"> on load. </w:t>
+      </w:r>
+      <w:r>
+        <w:rPr>
+          <w:b/>
+        </w:rPr>
+        <w:t xml:space="preserve">Root cause: an entire training and certificate subsystem in JavaScript whose markup lives on `training.html` and was never present here.</w:t>
+      </w:r>
+      <w:r>
+        <w:t xml:space="preserve"> Twenty element IDs referenced by </w:t>
+      </w:r>
+      <w:r>
+        <w:rPr>
+          <w:rFonts w:ascii="Consolas" w:hAnsi="Consolas"/>
+        </w:rPr>
+        <w:t xml:space="preserve">getElementById</w:t>
+      </w:r>
+      <w:r>
+        <w:t xml:space="preserve"> did not exist, and </w:t>
+      </w:r>
+      <w:r>
+        <w:rPr>
+          <w:rFonts w:ascii="Consolas" w:hAnsi="Consolas"/>
+        </w:rPr>
+        <w:t xml:space="preserve">updateProgress()</w:t>
+      </w:r>
+      <w:r>
+        <w:t xml:space="preserve"> ran on load against that empty DOM. Twelve functions and the </w:t>
+      </w:r>
+      <w:r>
+        <w:rPr>
+          <w:rFonts w:ascii="Consolas" w:hAnsi="Consolas"/>
+        </w:rPr>
+        <w:t xml:space="preserve">jrs_completed</w:t>
+      </w:r>
+      <w:r>
+        <w:t xml:space="preserve"> state they alone used were removed, </w:t>
+      </w:r>
+      <w:r>
+        <w:rPr>
+          <w:b/>
+        </w:rPr>
+        <w:t xml:space="preserve">8,481 bytes</w:t>
+      </w:r>
+      <w:r>
+        <w:t xml:space="preserve">, after confirming no external call site. </w:t>
+      </w:r>
+      <w:r>
+        <w:rPr>
+          <w:b/>
+        </w:rPr>
+        <w:t xml:space="preserve">The 2-div imbalance was separate</w:t>
+      </w:r>
+      <w:r>
+        <w:t xml:space="preserve">: </w:t>
+      </w:r>
+      <w:r>
+        <w:rPr>
+          <w:rFonts w:ascii="Consolas" w:hAnsi="Consolas"/>
+        </w:rPr>
+        <w:t xml:space="preserve">section-library</w:t>
+      </w:r>
+      <w:r>
+        <w:t xml:space="preserve"> and its container never closed, so every later </w:t>
+      </w:r>
+      <w:r>
+        <w:rPr>
+          <w:rFonts w:ascii="Consolas" w:hAnsi="Consolas"/>
+        </w:rPr>
+        <w:t xml:space="preserve">page-section</w:t>
+      </w:r>
+      <w:r>
+        <w:t xml:space="preserve"> nested one level deeper. Both fixed; the page now loads with </w:t>
+      </w:r>
+      <w:r>
+        <w:rPr>
+          <w:b/>
+        </w:rPr>
+        <w:t xml:space="preserve">zero errors</w:t>
+      </w:r>
+      <w:r>
+        <w:t xml:space="preserve">, and markup balances at 3106.</w:t>
       </w:r>
     </w:p>
     <w:p>
@@ -3498,21 +3567,24 @@
         <w:spacing w:after="140"/>
       </w:pPr>
       <w:r>
-        <w:t xml:space="preserve">P5: optional, information architecture</w:t>
-      </w:r>
-    </w:p>
-    <w:p>
-      <w:pPr>
-        <w:spacing w:after="140"/>
-      </w:pPr>
-      <w:r>
-        <w:rPr>
-          <w:b/>
-        </w:rPr>
-        <w:t xml:space="preserve">Link the 16 `reference/` pages from a hub.</w:t>
-      </w:r>
-      <w:r>
-        <w:t xml:space="preserve"> They are crawlable but carry almost no internal link equity.</w:t>
+        <w:t xml:space="preserve">P5: CLOSED 2026-08-14</w:t>
+      </w:r>
+    </w:p>
+    <w:p>
+      <w:pPr>
+        <w:spacing w:after="140"/>
+      </w:pPr>
+      <w:r>
+        <w:t xml:space="preserve">The hub already existed and links all sixteen. It is now linked from </w:t>
+      </w:r>
+      <w:r>
+        <w:rPr>
+          <w:b/>
+        </w:rPr>
+        <w:t xml:space="preserve">38 page footers</w:t>
+      </w:r>
+      <w:r>
+        <w:t xml:space="preserve"> so it pools equity site-wide.</w:t>
       </w:r>
     </w:p>
     <w:p>
@@ -3521,21 +3593,15 @@
         <w:spacing w:after="140"/>
       </w:pPr>
       <w:r>
-        <w:t xml:space="preserve">P6: pre-existing, unrelated</w:t>
-      </w:r>
-    </w:p>
-    <w:p>
-      <w:pPr>
-        <w:spacing w:after="140"/>
-      </w:pPr>
-      <w:r>
-        <w:rPr>
-          <w:b/>
-        </w:rPr>
-        <w:t xml:space="preserve">Repair the `jrsstandard.html` null-reference error</w:t>
-      </w:r>
-      <w:r>
-        <w:t xml:space="preserve"> and its 2-div imbalance. Neither affects the commercial path.</w:t>
+        <w:t xml:space="preserve">P6: CLOSED 2026-08-14</w:t>
+      </w:r>
+    </w:p>
+    <w:p>
+      <w:pPr>
+        <w:spacing w:after="140"/>
+      </w:pPr>
+      <w:r>
+        <w:t xml:space="preserve">Root cause found and fixed. See 2.4.</w:t>
       </w:r>
     </w:p>
     <w:p>
@@ -3617,10 +3683,22 @@
         <w:spacing w:after="60"/>
       </w:pPr>
       <w:r>
-        <w:rPr>
-          <w:b/>
-        </w:rPr>
-        <w:t xml:space="preserve">The `jrsstandard.html` defect was confirmed but not diagnosed to root cause.</w:t>
+        <w:t xml:space="preserve">~~The </w:t>
+      </w:r>
+      <w:r>
+        <w:rPr>
+          <w:rFonts w:ascii="Consolas" w:hAnsi="Consolas"/>
+        </w:rPr>
+        <w:t xml:space="preserve">jrsstandard.html</w:t>
+      </w:r>
+      <w:r>
+        <w:t xml:space="preserve"> defect was confirmed but not diagnosed to root cause.~~ </w:t>
+      </w:r>
+      <w:r>
+        <w:rPr>
+          <w:b/>
+        </w:rPr>
+        <w:t xml:space="preserve">Diagnosed and fixed 2026-08-14. See 2.4.</w:t>
       </w:r>
     </w:p>
     <w:p>

</xml_diff>